<commit_message>
Update Assessment Task Two 2024.v2.0 - SprintTwo .docx
</commit_message>
<xml_diff>
--- a/P305532-C#-AT2-Sprint one/Assessment Task Two 2024.v2.0 - SprintTwo .docx
+++ b/P305532-C#-AT2-Sprint one/Assessment Task Two 2024.v2.0 - SprintTwo .docx
@@ -8645,7 +8645,13 @@
               <w:spacing w:after="120"/>
             </w:pPr>
             <w:r>
-              <w:t>The sequential sort method must be coded using a single FOR loop and one IF condition.</w:t>
+              <w:t xml:space="preserve">The sequential </w:t>
+            </w:r>
+            <w:r>
+              <w:t>search</w:t>
+            </w:r>
+            <w:r>
+              <w:t xml:space="preserve"> must be coded using a single FOR loop and one IF condition.</w:t>
             </w:r>
           </w:p>
         </w:tc>
@@ -8713,32 +8719,6 @@
                 <w:lang w:eastAsia="ko-KR"/>
               </w:rPr>
             </w:pPr>
-            <w:r>
-              <w:t>The program provides detailed t</w:t>
-            </w:r>
-            <w:r>
-              <w:t>ooltips for</w:t>
-            </w:r>
-            <w:r>
-              <w:t xml:space="preserve"> </w:t>
-            </w:r>
-            <w:r>
-              <w:rPr>
-                <w:rFonts w:hint="eastAsia"/>
-                <w:lang w:eastAsia="ko-KR"/>
-              </w:rPr>
-              <w:t>a</w:t>
-            </w:r>
-            <w:r>
-              <w:t>ll GUI components</w:t>
-            </w:r>
-            <w:r>
-              <w:rPr>
-                <w:rFonts w:hint="eastAsia"/>
-                <w:lang w:eastAsia="ko-KR"/>
-              </w:rPr>
-              <w:t>.</w:t>
-            </w:r>
           </w:p>
         </w:tc>
       </w:tr>
@@ -8901,6 +8881,48 @@
             </w:r>
             <w:r>
               <w:t>to track code changes and updates.</w:t>
+            </w:r>
+          </w:p>
+        </w:tc>
+      </w:tr>
+      <w:tr>
+        <w:trPr>
+          <w:jc w:val="center"/>
+        </w:trPr>
+        <w:tc>
+          <w:tcPr>
+            <w:tcW w:w="9561" w:type="dxa"/>
+            <w:gridSpan w:val="5"/>
+          </w:tcPr>
+          <w:p>
+            <w:pPr>
+              <w:spacing w:after="120"/>
+            </w:pPr>
+            <w:r>
+              <w:t>The program provides detailed t</w:t>
+            </w:r>
+            <w:r>
+              <w:t>ooltips for</w:t>
+            </w:r>
+            <w:r>
+              <w:t xml:space="preserve"> </w:t>
+            </w:r>
+            <w:r>
+              <w:rPr>
+                <w:rFonts w:hint="eastAsia"/>
+                <w:lang w:eastAsia="ko-KR"/>
+              </w:rPr>
+              <w:t>a</w:t>
+            </w:r>
+            <w:r>
+              <w:t>ll GUI components</w:t>
+            </w:r>
+            <w:r>
+              <w:rPr>
+                <w:rFonts w:hint="eastAsia"/>
+                <w:lang w:eastAsia="ko-KR"/>
+              </w:rPr>
+              <w:t>.</w:t>
             </w:r>
           </w:p>
         </w:tc>
@@ -9025,6 +9047,7 @@
               <w:spacing w:after="0" w:line="240" w:lineRule="auto"/>
             </w:pPr>
             <w:r>
+              <w:lastRenderedPageBreak/>
               <w:t>GUI Development Tool</w:t>
             </w:r>
           </w:p>
@@ -9120,7 +9143,6 @@
               <w:spacing w:after="0" w:line="240" w:lineRule="auto"/>
             </w:pPr>
             <w:r>
-              <w:lastRenderedPageBreak/>
               <w:t>UI Components</w:t>
             </w:r>
           </w:p>
@@ -9445,7 +9467,6 @@
             <w:r>
               <w:t xml:space="preserve">utton will calculate </w:t>
             </w:r>
-            <w:proofErr w:type="gramStart"/>
             <w:r>
               <w:rPr>
                 <w:lang w:eastAsia="ko-KR"/>
@@ -9460,11 +9481,7 @@
               <w:t xml:space="preserve"> </w:t>
             </w:r>
             <w:r>
-              <w:t xml:space="preserve"> and</w:t>
-            </w:r>
-            <w:proofErr w:type="gramEnd"/>
-            <w:r>
-              <w:t xml:space="preserve"> display the result in the text box</w:t>
+              <w:t>and display the result in the text box</w:t>
             </w:r>
             <w:r>
               <w:rPr>
@@ -10023,13 +10040,13 @@
         <w:tblLook w:val="04A0" w:firstRow="1" w:lastRow="0" w:firstColumn="1" w:lastColumn="0" w:noHBand="0" w:noVBand="1"/>
       </w:tblPr>
       <w:tblGrid>
-        <w:gridCol w:w="2122"/>
-        <w:gridCol w:w="73"/>
-        <w:gridCol w:w="2810"/>
-        <w:gridCol w:w="1212"/>
-        <w:gridCol w:w="724"/>
-        <w:gridCol w:w="1276"/>
-        <w:gridCol w:w="1417"/>
+        <w:gridCol w:w="1277"/>
+        <w:gridCol w:w="216"/>
+        <w:gridCol w:w="2755"/>
+        <w:gridCol w:w="1616"/>
+        <w:gridCol w:w="691"/>
+        <w:gridCol w:w="1620"/>
+        <w:gridCol w:w="1679"/>
       </w:tblGrid>
       <w:tr>
         <w:tc>
@@ -11009,6 +11026,7 @@
           </w:tcPr>
           <w:p>
             <w:r>
+              <w:lastRenderedPageBreak/>
               <w:t>Local Source Control Screen Shot</w:t>
             </w:r>
           </w:p>
@@ -11024,7 +11042,54 @@
             </w:tcBorders>
             <w:shd w:val="clear" w:color="auto" w:fill="auto"/>
           </w:tcPr>
-          <w:p/>
+          <w:p>
+            <w:r>
+              <w:rPr>
+                <w:noProof/>
+              </w:rPr>
+              <w:drawing>
+                <wp:inline distT="0" distB="0" distL="0" distR="0" wp14:anchorId="73846D6E" wp14:editId="160132EC">
+                  <wp:extent cx="5305425" cy="4199255"/>
+                  <wp:effectExtent l="0" t="0" r="9525" b="0"/>
+                  <wp:docPr id="750207203" name="Picture 11" descr="A screenshot of a computer&#10;&#10;Description automatically generated"/>
+                  <wp:cNvGraphicFramePr>
+                    <a:graphicFrameLocks xmlns:a="http://schemas.openxmlformats.org/drawingml/2006/main" noChangeAspect="1"/>
+                  </wp:cNvGraphicFramePr>
+                  <a:graphic xmlns:a="http://schemas.openxmlformats.org/drawingml/2006/main">
+                    <a:graphicData uri="http://schemas.openxmlformats.org/drawingml/2006/picture">
+                      <pic:pic xmlns:pic="http://schemas.openxmlformats.org/drawingml/2006/picture">
+                        <pic:nvPicPr>
+                          <pic:cNvPr id="750207203" name="Picture 11" descr="A screenshot of a computer&#10;&#10;Description automatically generated"/>
+                          <pic:cNvPicPr/>
+                        </pic:nvPicPr>
+                        <pic:blipFill>
+                          <a:blip r:embed="rId21">
+                            <a:extLst>
+                              <a:ext uri="{28A0092B-C50C-407E-A947-70E740481C1C}">
+                                <a14:useLocalDpi xmlns:a14="http://schemas.microsoft.com/office/drawing/2010/main" val="0"/>
+                              </a:ext>
+                            </a:extLst>
+                          </a:blip>
+                          <a:stretch>
+                            <a:fillRect/>
+                          </a:stretch>
+                        </pic:blipFill>
+                        <pic:spPr>
+                          <a:xfrm>
+                            <a:off x="0" y="0"/>
+                            <a:ext cx="5305425" cy="4199255"/>
+                          </a:xfrm>
+                          <a:prstGeom prst="rect">
+                            <a:avLst/>
+                          </a:prstGeom>
+                        </pic:spPr>
+                      </pic:pic>
+                    </a:graphicData>
+                  </a:graphic>
+                </wp:inline>
+              </w:drawing>
+            </w:r>
+          </w:p>
         </w:tc>
       </w:tr>
       <w:tr>
@@ -15129,9 +15194,9 @@
       <w:bookmarkEnd w:id="0"/>
     </w:p>
     <w:sectPr>
-      <w:headerReference w:type="even" r:id="rId21"/>
-      <w:headerReference w:type="default" r:id="rId22"/>
-      <w:headerReference w:type="first" r:id="rId23"/>
+      <w:headerReference w:type="even" r:id="rId22"/>
+      <w:headerReference w:type="default" r:id="rId23"/>
+      <w:headerReference w:type="first" r:id="rId24"/>
       <w:pgSz w:w="11906" w:h="16838"/>
       <w:pgMar w:top="1985" w:right="1134" w:bottom="1701" w:left="1134" w:header="568" w:footer="457" w:gutter="0"/>
       <w:cols w:space="708"/>

</xml_diff>